<commit_message>
Topic 12 — Multi-Head Attention Part 2
</commit_message>
<xml_diff>
--- a/12_multihead_p2/Topic12_MultiHeadAttention_P2.docx
+++ b/12_multihead_p2/Topic12_MultiHeadAttention_P2.docx
@@ -4,7 +4,7 @@
   <w:body>
     <w:p>
       <w:pPr>
-        <w:spacing w:after="80" w:before="600"/>
+        <w:spacing w:after="80" w:before="400"/>
         <w:jc w:val="center"/>
       </w:pPr>
       <w:r>
@@ -21,7 +21,7 @@
     </w:p>
     <w:p>
       <w:pPr>
-        <w:spacing w:after="400" w:before="0"/>
+        <w:spacing w:after="280" w:before="0"/>
         <w:jc w:val="center"/>
       </w:pPr>
       <w:r>
@@ -38,7 +38,7 @@
     </w:p>
     <w:p>
       <w:pPr>
-        <w:spacing w:after="80" w:before="400"/>
+        <w:spacing w:after="60" w:before="240"/>
         <w:jc w:val="center"/>
       </w:pPr>
       <w:r>
@@ -64,15 +64,15 @@
           <w:b/>
           <w:bCs/>
           <w:color w:val="0D3B6E"/>
-          <w:sz w:val="48"/>
-          <w:szCs w:val="48"/>
+          <w:sz w:val="44"/>
+          <w:szCs w:val="44"/>
         </w:rPr>
         <w:t xml:space="preserve">Multi-Head Attention</w:t>
       </w:r>
     </w:p>
     <w:p>
       <w:pPr>
-        <w:spacing w:after="80" w:before="0"/>
+        <w:spacing w:after="60" w:before="0"/>
         <w:jc w:val="center"/>
       </w:pPr>
       <w:r>
@@ -81,15 +81,15 @@
           <w:b/>
           <w:bCs/>
           <w:color w:val="2E75B6"/>
-          <w:sz w:val="32"/>
-          <w:szCs w:val="32"/>
+          <w:sz w:val="28"/>
+          <w:szCs w:val="28"/>
         </w:rPr>
         <w:t xml:space="preserve">Part 2 — The Weight-Split Implementation</w:t>
       </w:r>
     </w:p>
     <w:p>
       <w:pPr>
-        <w:spacing w:after="300" w:before="0"/>
+        <w:spacing w:after="200" w:before="0"/>
         <w:jc w:val="center"/>
       </w:pPr>
       <w:r>
@@ -121,7 +121,7 @@
     </w:p>
     <w:p>
       <w:pPr>
-        <w:spacing w:after="40" w:before="0"/>
+        <w:spacing w:after="30" w:before="0"/>
         <w:jc w:val="center"/>
       </w:pPr>
       <w:r>
@@ -138,7 +138,7 @@
     </w:p>
     <w:p>
       <w:pPr>
-        <w:spacing w:after="40" w:before="0"/>
+        <w:spacing w:after="30" w:before="0"/>
         <w:jc w:val="center"/>
       </w:pPr>
       <w:r>
@@ -153,10 +153,10 @@
     </w:p>
     <w:p>
       <w:pPr>
-        <w:spacing w:after="160" w:before="0"/>
+        <w:spacing w:after="100" w:before="0"/>
         <w:jc w:val="center"/>
       </w:pPr>
-      <w:hyperlink w:history="1" r:id="rIdkxbs4uarl02odq1jdyr-v">
+      <w:hyperlink w:history="1" r:id="rId3yrgyit0m0n7weu7hatsh">
         <w:r>
           <w:rPr>
             <w:rFonts w:ascii="Times New Roman" w:cs="Times New Roman" w:eastAsia="Times New Roman" w:hAnsi="Times New Roman"/>
@@ -173,7 +173,7 @@
     </w:p>
     <w:p>
       <w:pPr>
-        <w:spacing w:after="160" w:before="0"/>
+        <w:spacing w:after="100" w:before="0"/>
         <w:jc w:val="center"/>
       </w:pPr>
       <w:r>
@@ -203,7 +203,7 @@
     </w:p>
     <w:p>
       <w:pPr>
-        <w:spacing w:after="120" w:before="80"/>
+        <w:spacing w:after="80" w:before="40"/>
         <w:jc w:val="center"/>
       </w:pPr>
       <w:r>

</xml_diff>